<commit_message>
fix: enforce AESG Office typography contract
</commit_message>
<xml_diff>
--- a/deploy/skills/aesg-branding/assets/templates/AESG_Letterhead_Dubai.docx
+++ b/deploy/skills/aesg-branding/assets/templates/AESG_Letterhead_Dubai.docx
@@ -643,7 +643,7 @@
         </w:pBdr>
         <w:shd w:fill="auto" w:val="clear"/>
         <w:spacing w:after="0" w:before="0" w:line="240" w:lineRule="auto"/>
-        <w:ind w:left="2160" w:right="0" w:hanging="180.99999999999994"/>
+        <w:ind w:left="2160" w:right="0" w:hanging="180"/>
         <w:jc w:val="left"/>
         <w:rPr/>
       </w:pPr>
@@ -691,7 +691,7 @@
         </w:pBdr>
         <w:shd w:fill="auto" w:val="clear"/>
         <w:spacing w:after="0" w:before="0" w:line="240" w:lineRule="auto"/>
-        <w:ind w:left="2160" w:right="0" w:hanging="180.99999999999994"/>
+        <w:ind w:left="2160" w:right="0" w:hanging="180"/>
         <w:jc w:val="left"/>
         <w:rPr/>
       </w:pPr>
@@ -941,7 +941,7 @@
         </w:pBdr>
         <w:shd w:fill="auto" w:val="clear"/>
         <w:spacing w:after="0" w:before="0" w:line="240" w:lineRule="auto"/>
-        <w:ind w:left="2160" w:right="0" w:hanging="180.99999999999994"/>
+        <w:ind w:left="2160" w:right="0" w:hanging="180"/>
         <w:jc w:val="left"/>
         <w:rPr/>
       </w:pPr>
@@ -989,7 +989,7 @@
         </w:pBdr>
         <w:shd w:fill="auto" w:val="clear"/>
         <w:spacing w:after="0" w:before="0" w:line="240" w:lineRule="auto"/>
-        <w:ind w:left="2160" w:right="0" w:hanging="180.99999999999994"/>
+        <w:ind w:left="2160" w:right="0" w:hanging="180"/>
         <w:jc w:val="left"/>
         <w:rPr/>
       </w:pPr>
@@ -3873,6 +3873,12 @@
   </w:style>
   <w:style w:type="paragraph" w:styleId="Normal" w:default="1">
     <w:name w:val="normal"/>
+    <w:rPr>
+      <w:rFonts w:ascii="Verdana" w:hAnsi="Verdana" w:eastAsia="Verdana" w:cs="Verdana"/>
+      <w:sz w:val="18"/>
+      <w:szCs w:val="18"/>
+      <w:color w:val="53565A"/>
+    </w:rPr>
   </w:style>
   <w:style w:type="paragraph" w:styleId="Heading1">
     <w:name w:val="heading 1"/>
@@ -3886,9 +3892,10 @@
     <w:rPr>
       <w:b w:val="1"/>
       <w:bCs w:val="1"/>
-      <w:color w:val="008c95"/>
+      <w:color w:val="008C95"/>
       <w:sz w:val="24"/>
       <w:szCs w:val="24"/>
+      <w:rFonts w:ascii="Verdana" w:hAnsi="Verdana" w:eastAsia="Verdana" w:cs="Verdana"/>
     </w:rPr>
   </w:style>
   <w:style w:type="paragraph" w:styleId="Heading2">
@@ -3901,7 +3908,10 @@
       <w:spacing w:before="200" w:lineRule="auto"/>
     </w:pPr>
     <w:rPr>
-      <w:color w:val="008c95"/>
+      <w:color w:val="53565A"/>
+      <w:rFonts w:ascii="Verdana" w:hAnsi="Verdana" w:eastAsia="Verdana" w:cs="Verdana"/>
+      <w:sz w:val="18"/>
+      <w:szCs w:val="18"/>
     </w:rPr>
   </w:style>
   <w:style w:type="paragraph" w:styleId="Heading3">
@@ -4001,9 +4011,21 @@
   </w:style>
   <w:style w:type="paragraph" w:styleId="Normal" w:default="1">
     <w:name w:val="normal"/>
+    <w:rPr>
+      <w:rFonts w:ascii="Verdana" w:hAnsi="Verdana" w:eastAsia="Verdana" w:cs="Verdana"/>
+      <w:sz w:val="18"/>
+      <w:szCs w:val="18"/>
+      <w:color w:val="53565A"/>
+    </w:rPr>
   </w:style>
   <w:style w:type="paragraph" w:styleId="Normal" w:default="1">
     <w:name w:val="normal"/>
+    <w:rPr>
+      <w:rFonts w:ascii="Verdana" w:hAnsi="Verdana" w:eastAsia="Verdana" w:cs="Verdana"/>
+      <w:sz w:val="18"/>
+      <w:szCs w:val="18"/>
+      <w:color w:val="53565A"/>
+    </w:rPr>
   </w:style>
   <w:style w:type="table" w:styleId="TableNormal" w:default="1">
     <w:name w:val="TableNormal"/>

</xml_diff>

<commit_message>
fix: repair AESG DOCX typography and layout
</commit_message>
<xml_diff>
--- a/deploy/skills/aesg-branding/assets/templates/AESG_Letterhead_Dubai.docx
+++ b/deploy/skills/aesg-branding/assets/templates/AESG_Letterhead_Dubai.docx
@@ -2600,11 +2600,10 @@
         <w:iCs w:val="0"/>
         <w:smallCaps w:val="0"/>
         <w:strike w:val="0"/>
-        <w:color w:val="53565a"/>
+        <w:color w:val="53565A"/>
         <w:sz w:val="14"/>
         <w:szCs w:val="14"/>
         <w:u w:val="none"/>
-        <w:shd w:fill="auto" w:val="clear"/>
         <w:vertAlign w:val="baseline"/>
       </w:rPr>
     </w:pPr>
@@ -2617,11 +2616,10 @@
         <w:iCs w:val="0"/>
         <w:smallCaps w:val="0"/>
         <w:strike w:val="0"/>
-        <w:color w:val="53565a"/>
+        <w:color w:val="53565A"/>
         <w:sz w:val="14"/>
         <w:szCs w:val="14"/>
         <w:u w:val="none"/>
-        <w:shd w:fill="auto" w:val="clear"/>
         <w:vertAlign w:val="baseline"/>
       </w:rPr>
       <w:fldChar w:fldCharType="begin"/>
@@ -2663,11 +2661,10 @@
         <w:iCs w:val="0"/>
         <w:smallCaps w:val="0"/>
         <w:strike w:val="0"/>
-        <w:color w:val="53565a"/>
+        <w:color w:val="53565A"/>
         <w:sz w:val="14"/>
         <w:szCs w:val="14"/>
         <w:u w:val="none"/>
-        <w:shd w:fill="auto" w:val="clear"/>
         <w:vertAlign w:val="baseline"/>
       </w:rPr>
     </w:pPr>
@@ -2685,7 +2682,7 @@
   <w:p>
     <w:pPr>
       <w:rPr>
-        <w:color w:val="008c95"/>
+        <w:color w:val="53565A"/>
         <w:sz w:val="14"/>
         <w:szCs w:val="14"/>
       </w:rPr>
@@ -2694,7 +2691,7 @@
       <w:rPr>
         <w:b w:val="1"/>
         <w:bCs w:val="1"/>
-        <w:color w:val="008c95"/>
+        <w:color w:val="53565A"/>
         <w:sz w:val="14"/>
         <w:szCs w:val="14"/>
         <w:rtl w:val="0"/>
@@ -2703,7 +2700,7 @@
     </w:r>
     <w:r>
       <w:rPr>
-        <w:color w:val="008c95"/>
+        <w:color w:val="53565A"/>
         <w:sz w:val="14"/>
         <w:szCs w:val="14"/>
         <w:rtl w:val="0"/>
@@ -2762,7 +2759,7 @@
                               <w:i w:val="0"/>
                               <w:smallCaps w:val="0"/>
                               <w:strike w:val="0"/>
-                              <w:color w:val="008c95"/>
+                              <w:color w:val="53565A"/>
                               <w:sz w:val="14"/>
                               <w:vertAlign w:val="baseline"/>
                             </w:rPr>
@@ -2783,7 +2780,7 @@
                               <w:i w:val="0"/>
                               <w:smallCaps w:val="0"/>
                               <w:strike w:val="0"/>
-                              <w:color w:val="008c95"/>
+                              <w:color w:val="53565A"/>
                               <w:sz w:val="14"/>
                               <w:vertAlign w:val="baseline"/>
                             </w:rPr>
@@ -2795,7 +2792,7 @@
                               <w:i w:val="0"/>
                               <w:smallCaps w:val="0"/>
                               <w:strike w:val="0"/>
-                              <w:color w:val="53565a"/>
+                              <w:color w:val="53565A"/>
                               <w:sz w:val="14"/>
                               <w:vertAlign w:val="baseline"/>
                             </w:rPr>
@@ -2861,14 +2858,14 @@
   <w:p>
     <w:pPr>
       <w:rPr>
-        <w:color w:val="008c95"/>
+        <w:color w:val="53565A"/>
         <w:sz w:val="14"/>
         <w:szCs w:val="14"/>
       </w:rPr>
     </w:pPr>
     <w:r>
       <w:rPr>
-        <w:color w:val="008c95"/>
+        <w:color w:val="53565A"/>
         <w:sz w:val="14"/>
         <w:szCs w:val="14"/>
         <w:rtl w:val="0"/>
@@ -2899,7 +2896,7 @@
       <w:rPr>
         <w:b w:val="1"/>
         <w:bCs w:val="1"/>
-        <w:color w:val="008c95"/>
+        <w:color w:val="53565A"/>
         <w:sz w:val="14"/>
         <w:szCs w:val="14"/>
       </w:rPr>
@@ -2938,11 +2935,10 @@
         <w:iCs w:val="0"/>
         <w:smallCaps w:val="0"/>
         <w:strike w:val="0"/>
-        <w:color w:val="008c95"/>
+        <w:color w:val="53565A"/>
         <w:sz w:val="14"/>
         <w:szCs w:val="14"/>
         <w:u w:val="none"/>
-        <w:shd w:fill="auto" w:val="clear"/>
         <w:vertAlign w:val="baseline"/>
       </w:rPr>
     </w:pPr>
@@ -2955,11 +2951,10 @@
         <w:iCs w:val="0"/>
         <w:smallCaps w:val="0"/>
         <w:strike w:val="0"/>
-        <w:color w:val="008c95"/>
+        <w:color w:val="53565A"/>
         <w:sz w:val="14"/>
         <w:szCs w:val="14"/>
         <w:u w:val="none"/>
-        <w:shd w:fill="auto" w:val="clear"/>
         <w:vertAlign w:val="baseline"/>
         <w:rtl w:val="0"/>
       </w:rPr>
@@ -2999,11 +2994,10 @@
         <w:iCs w:val="0"/>
         <w:smallCaps w:val="0"/>
         <w:strike w:val="0"/>
-        <w:color w:val="53565a"/>
+        <w:color w:val="53565A"/>
         <w:sz w:val="14"/>
         <w:szCs w:val="14"/>
         <w:u w:val="none"/>
-        <w:shd w:fill="auto" w:val="clear"/>
         <w:vertAlign w:val="baseline"/>
       </w:rPr>
     </w:pPr>
@@ -3016,11 +3010,10 @@
         <w:iCs w:val="0"/>
         <w:smallCaps w:val="0"/>
         <w:strike w:val="0"/>
-        <w:color w:val="53565a"/>
+        <w:color w:val="53565A"/>
         <w:sz w:val="14"/>
         <w:szCs w:val="14"/>
         <w:u w:val="none"/>
-        <w:shd w:fill="auto" w:val="clear"/>
         <w:vertAlign w:val="baseline"/>
       </w:rPr>
       <w:fldChar w:fldCharType="begin"/>
@@ -3062,11 +3055,10 @@
         <w:iCs w:val="0"/>
         <w:smallCaps w:val="0"/>
         <w:strike w:val="0"/>
-        <w:color w:val="53565a"/>
+        <w:color w:val="53565A"/>
         <w:sz w:val="14"/>
         <w:szCs w:val="14"/>
         <w:u w:val="none"/>
-        <w:shd w:fill="auto" w:val="clear"/>
         <w:vertAlign w:val="baseline"/>
       </w:rPr>
     </w:pPr>
@@ -3266,7 +3258,7 @@
               <wp:positionV relativeFrom="paragraph">
                 <wp:posOffset>9209669</wp:posOffset>
               </wp:positionV>
-              <wp:extent cx="2278883" cy="734339"/>
+              <wp:extent cx="2413000" cy="228600"/>
               <wp:effectExtent b="0" l="0" r="0" t="0"/>
               <wp:wrapNone/>
               <wp:docPr id="17" name=""/>
@@ -3278,7 +3270,7 @@
                     <wps:spPr>
                       <a:xfrm>
                         <a:off x="4101300" y="3394050"/>
-                        <a:ext cx="2489400" cy="771900"/>
+                        <a:ext cx="2413000" cy="228600"/>
                       </a:xfrm>
                       <a:prstGeom prst="rect">
                         <a:avLst/>
@@ -3526,7 +3518,7 @@
                         </w:p>
                       </w:txbxContent>
                     </wps:txbx>
-                    <wps:bodyPr anchorCtr="0" anchor="t" bIns="45700" lIns="91425" spcFirstLastPara="1" rIns="91425" wrap="square" tIns="45700">
+                    <wps:bodyPr anchorCtr="0" anchor="t" bIns="45700" lIns="91425" spcFirstLastPara="1" rIns="91425" wrap="square" tIns="45700" vertOverflow="overflow">
                       <a:noAutofit/>
                     </wps:bodyPr>
                   </wps:wsp>
@@ -3850,7 +3842,7 @@
     <w:rPrDefault>
       <w:rPr>
         <w:rFonts w:ascii="Verdana" w:cs="Verdana" w:eastAsia="Verdana" w:hAnsi="Verdana"/>
-        <w:color w:val="53565a"/>
+        <w:color w:val="53565A"/>
         <w:sz w:val="18"/>
         <w:szCs w:val="18"/>
         <w:lang w:val="en_GB"/>
@@ -4066,7 +4058,7 @@
     <w:unhideWhenUsed w:val="1"/>
     <w:rsid w:val="00030C8F"/>
     <w:rPr>
-      <w:rFonts w:ascii="Lucida Grande" w:cs="Lucida Grande" w:hAnsi="Lucida Grande"/>
+      <w:rFonts w:ascii="Verdana" w:cs="Verdana" w:hAnsi="Verdana" w:eastAsia="Verdana"/>
       <w:szCs w:val="18"/>
     </w:rPr>
   </w:style>
@@ -4078,7 +4070,7 @@
     <w:semiHidden w:val="1"/>
     <w:rsid w:val="00030C8F"/>
     <w:rPr>
-      <w:rFonts w:ascii="Lucida Grande" w:cs="Lucida Grande" w:hAnsi="Lucida Grande"/>
+      <w:rFonts w:ascii="Verdana" w:cs="Verdana" w:hAnsi="Verdana" w:eastAsia="Verdana"/>
       <w:sz w:val="18"/>
       <w:szCs w:val="18"/>
     </w:rPr>
@@ -4138,8 +4130,8 @@
     <w:unhideWhenUsed w:val="1"/>
     <w:rsid w:val="00775FB7"/>
     <w:rPr>
-      <w:rFonts w:ascii="Verdana" w:hAnsi="Verdana"/>
-      <w:color w:val="008c95" w:themeColor="text2"/>
+      <w:rFonts w:ascii="Verdana" w:hAnsi="Verdana" w:eastAsia="Verdana" w:cs="Verdana"/>
+      <w:color w:val="008c95"/>
       <w:u w:val="none"/>
     </w:rPr>
   </w:style>
@@ -4150,10 +4142,10 @@
     <w:uiPriority w:val="9"/>
     <w:rsid w:val="00965AD5"/>
     <w:rPr>
-      <w:rFonts w:cstheme="majorBidi" w:eastAsiaTheme="majorEastAsia"/>
+      <w:rFonts w:ascii="Verdana" w:hAnsi="Verdana" w:eastAsia="Verdana" w:cs="Verdana"/>
       <w:b w:val="1"/>
       <w:bCs w:val="1"/>
-      <w:color w:val="008c95" w:themeColor="text2"/>
+      <w:color w:val="008c95"/>
       <w:sz w:val="24"/>
       <w:szCs w:val="32"/>
     </w:rPr>
@@ -4165,9 +4157,9 @@
     <w:uiPriority w:val="9"/>
     <w:rsid w:val="00965AD5"/>
     <w:rPr>
-      <w:rFonts w:cstheme="majorBidi" w:eastAsiaTheme="majorEastAsia"/>
+      <w:rFonts w:ascii="Verdana" w:hAnsi="Verdana" w:eastAsia="Verdana" w:cs="Verdana"/>
       <w:bCs w:val="1"/>
-      <w:color w:val="008c95" w:themeColor="text2"/>
+      <w:color w:val="008c95"/>
       <w:sz w:val="18"/>
       <w:szCs w:val="26"/>
     </w:rPr>
@@ -4179,8 +4171,8 @@
     <w:uiPriority w:val="10"/>
     <w:rsid w:val="00775FB7"/>
     <w:rPr>
-      <w:rFonts w:cstheme="majorBidi" w:eastAsiaTheme="majorEastAsia"/>
-      <w:color w:val="00686f" w:themeColor="text2" w:themeShade="0000BF"/>
+      <w:rFonts w:ascii="Verdana" w:hAnsi="Verdana" w:eastAsia="Verdana" w:cs="Verdana"/>
+      <w:color w:val="00686f"/>
       <w:spacing w:val="5"/>
       <w:kern w:val="28"/>
       <w:sz w:val="52"/>
@@ -4194,10 +4186,10 @@
     <w:uiPriority w:val="11"/>
     <w:rsid w:val="00775FB7"/>
     <w:rPr>
-      <w:rFonts w:cstheme="majorBidi" w:eastAsiaTheme="majorEastAsia"/>
+      <w:rFonts w:ascii="Verdana" w:hAnsi="Verdana" w:eastAsia="Verdana" w:cs="Verdana"/>
       <w:i w:val="1"/>
       <w:iCs w:val="1"/>
-      <w:color w:val="008c95" w:themeColor="text2"/>
+      <w:color w:val="008c95"/>
       <w:spacing w:val="15"/>
       <w:sz w:val="24"/>
       <w:szCs w:val="24"/>
@@ -4210,10 +4202,10 @@
     <w:qFormat w:val="1"/>
     <w:rsid w:val="00775FB7"/>
     <w:rPr>
-      <w:rFonts w:ascii="Verdana" w:hAnsi="Verdana"/>
+      <w:rFonts w:ascii="Verdana" w:hAnsi="Verdana" w:eastAsia="Verdana" w:cs="Verdana"/>
       <w:i w:val="1"/>
       <w:iCs w:val="1"/>
-      <w:color w:val="a7aaae" w:themeColor="text1" w:themeTint="00007F"/>
+      <w:color w:val="a7aaae"/>
     </w:rPr>
   </w:style>
   <w:style w:type="character" w:styleId="Emphasis">
@@ -4223,7 +4215,7 @@
     <w:qFormat w:val="1"/>
     <w:rsid w:val="00775FB7"/>
     <w:rPr>
-      <w:rFonts w:ascii="Verdana" w:hAnsi="Verdana"/>
+      <w:rFonts w:ascii="Verdana" w:hAnsi="Verdana" w:eastAsia="Verdana" w:cs="Verdana"/>
       <w:i w:val="1"/>
       <w:iCs w:val="1"/>
     </w:rPr>
@@ -4235,12 +4227,12 @@
     <w:qFormat w:val="1"/>
     <w:rsid w:val="00775FB7"/>
     <w:rPr>
-      <w:rFonts w:ascii="Verdana" w:hAnsi="Verdana"/>
+      <w:rFonts w:ascii="Verdana" w:hAnsi="Verdana" w:eastAsia="Verdana" w:cs="Verdana"/>
       <w:b w:val="1"/>
       <w:bCs w:val="1"/>
       <w:i w:val="1"/>
       <w:iCs w:val="1"/>
-      <w:color w:val="008c95" w:themeColor="text2"/>
+      <w:color w:val="008c95"/>
       <w:sz w:val="18"/>
     </w:rPr>
   </w:style>
@@ -4251,10 +4243,10 @@
     <w:qFormat w:val="1"/>
     <w:rsid w:val="00775FB7"/>
     <w:rPr>
-      <w:rFonts w:ascii="Verdana" w:hAnsi="Verdana"/>
+      <w:rFonts w:ascii="Verdana" w:hAnsi="Verdana" w:eastAsia="Verdana" w:cs="Verdana"/>
       <w:b w:val="1"/>
       <w:bCs w:val="1"/>
-      <w:color w:val="53565a" w:themeColor="text1"/>
+      <w:color w:val="53565a"/>
       <w:sz w:val="18"/>
     </w:rPr>
   </w:style>
@@ -4280,7 +4272,7 @@
     <w:rPr>
       <w:i w:val="1"/>
       <w:iCs w:val="1"/>
-      <w:color w:val="53565a" w:themeColor="text1"/>
+      <w:color w:val="53565a"/>
       <w:sz w:val="18"/>
     </w:rPr>
   </w:style>
@@ -4317,7 +4309,7 @@
       <w:bCs w:val="1"/>
       <w:i w:val="1"/>
       <w:iCs w:val="1"/>
-      <w:color w:val="53565a" w:themeColor="text1"/>
+      <w:color w:val="53565a"/>
       <w:sz w:val="18"/>
     </w:rPr>
   </w:style>
@@ -4328,11 +4320,11 @@
     <w:qFormat w:val="1"/>
     <w:rsid w:val="00775FB7"/>
     <w:rPr>
-      <w:rFonts w:ascii="Verdana" w:hAnsi="Verdana"/>
+      <w:rFonts w:ascii="Verdana" w:hAnsi="Verdana" w:eastAsia="Verdana" w:cs="Verdana"/>
       <w:b w:val="1"/>
       <w:bCs w:val="1"/>
       <w:smallCaps w:val="1"/>
-      <w:color w:val="53565a" w:themeColor="text1"/>
+      <w:color w:val="53565a"/>
       <w:spacing w:val="5"/>
       <w:sz w:val="18"/>
     </w:rPr>
@@ -4378,7 +4370,7 @@
     <w:uiPriority w:val="60"/>
     <w:rsid w:val="001E3FC6"/>
     <w:rPr>
-      <w:color w:val="3e4043" w:themeColor="text1" w:themeShade="0000BF"/>
+      <w:color w:val="3e4043"/>
     </w:rPr>
     <w:tblPr>
       <w:tblStyleRowBandSize w:val="1"/>
@@ -4471,7 +4463,7 @@
     <w:uiPriority w:val="60"/>
     <w:rsid w:val="001E3FC6"/>
     <w:rPr>
-      <w:color w:val="511859" w:themeColor="accent1" w:themeShade="0000BF"/>
+      <w:color w:val="511859"/>
     </w:rPr>
     <w:tblPr>
       <w:tblStyleRowBandSize w:val="1"/>
@@ -4564,7 +4556,7 @@
     <w:uiPriority w:val="60"/>
     <w:rsid w:val="001E3FC6"/>
     <w:rPr>
-      <w:color w:val="dfa400" w:themeColor="accent2" w:themeShade="0000BF"/>
+      <w:color w:val="dfa400"/>
     </w:rPr>
     <w:tblPr>
       <w:tblStyleRowBandSize w:val="1"/>
@@ -4657,7 +4649,7 @@
     <w:uiPriority w:val="60"/>
     <w:rsid w:val="001E3FC6"/>
     <w:rPr>
-      <w:color w:val="21989e" w:themeColor="accent4" w:themeShade="0000BF"/>
+      <w:color w:val="21989e"/>
     </w:rPr>
     <w:tblPr>
       <w:tblStyleRowBandSize w:val="1"/>
@@ -4750,7 +4742,7 @@
     <w:uiPriority w:val="60"/>
     <w:rsid w:val="001E3FC6"/>
     <w:rPr>
-      <w:color w:val="3e4043" w:themeColor="accent5" w:themeShade="0000BF"/>
+      <w:color w:val="3e4043"/>
     </w:rPr>
     <w:tblPr>
       <w:tblStyleRowBandSize w:val="1"/>
@@ -4859,7 +4851,7 @@
       <w:rPr>
         <w:b w:val="1"/>
         <w:bCs w:val="1"/>
-        <w:color w:val="ffffff" w:themeColor="background1"/>
+        <w:color w:val="ffffff"/>
       </w:rPr>
       <w:tblPr/>
       <w:tcPr>
@@ -4941,7 +4933,7 @@
       <w:rPr>
         <w:b w:val="1"/>
         <w:bCs w:val="1"/>
-        <w:color w:val="ffffff" w:themeColor="background1"/>
+        <w:color w:val="ffffff"/>
       </w:rPr>
       <w:tblPr/>
       <w:tcPr>
@@ -5023,7 +5015,7 @@
       <w:rPr>
         <w:b w:val="1"/>
         <w:bCs w:val="1"/>
-        <w:color w:val="ffffff" w:themeColor="background1"/>
+        <w:color w:val="ffffff"/>
       </w:rPr>
       <w:tblPr/>
       <w:tcPr>
@@ -5106,7 +5098,7 @@
       <w:rPr>
         <w:b w:val="1"/>
         <w:bCs w:val="1"/>
-        <w:color w:val="ffffff" w:themeColor="background1"/>
+        <w:color w:val="ffffff"/>
       </w:rPr>
       <w:tblPr/>
       <w:tcPr>
@@ -5202,7 +5194,7 @@
       <w:rPr>
         <w:b w:val="1"/>
         <w:bCs w:val="1"/>
-        <w:color w:val="ffffff" w:themeColor="background1"/>
+        <w:color w:val="ffffff"/>
       </w:rPr>
       <w:tblPr/>
       <w:tcPr>
@@ -5295,7 +5287,7 @@
       <w:rPr>
         <w:b w:val="1"/>
         <w:bCs w:val="1"/>
-        <w:color w:val="ffffff" w:themeColor="background1"/>
+        <w:color w:val="ffffff"/>
       </w:rPr>
       <w:tblPr/>
       <w:tcPr>
@@ -5334,7 +5326,7 @@
       <w:rPr>
         <w:b w:val="1"/>
         <w:bCs w:val="1"/>
-        <w:color w:val="ffffff" w:themeColor="background1"/>
+        <w:color w:val="ffffff"/>
       </w:rPr>
       <w:tblPr/>
       <w:tcPr>
@@ -5353,7 +5345,7 @@
       <w:rPr>
         <w:b w:val="1"/>
         <w:bCs w:val="1"/>
-        <w:color w:val="ffffff" w:themeColor="background1"/>
+        <w:color w:val="ffffff"/>
       </w:rPr>
       <w:tblPr/>
       <w:tcPr>
@@ -5399,7 +5391,7 @@
     </w:tblStylePr>
     <w:tblStylePr w:type="nwCell">
       <w:rPr>
-        <w:color w:val="ffffff" w:themeColor="background1"/>
+        <w:color w:val="ffffff"/>
       </w:rPr>
       <w:tblPr/>
       <w:tcPr>
@@ -5434,7 +5426,7 @@
       <w:rPr>
         <w:b w:val="1"/>
         <w:bCs w:val="1"/>
-        <w:color w:val="ffffff" w:themeColor="background1"/>
+        <w:color w:val="ffffff"/>
       </w:rPr>
       <w:tblPr/>
       <w:tcPr>
@@ -5473,7 +5465,7 @@
       <w:rPr>
         <w:b w:val="1"/>
         <w:bCs w:val="1"/>
-        <w:color w:val="ffffff" w:themeColor="background1"/>
+        <w:color w:val="ffffff"/>
       </w:rPr>
       <w:tblPr/>
       <w:tcPr>
@@ -5492,7 +5484,7 @@
       <w:rPr>
         <w:b w:val="1"/>
         <w:bCs w:val="1"/>
-        <w:color w:val="ffffff" w:themeColor="background1"/>
+        <w:color w:val="ffffff"/>
       </w:rPr>
       <w:tblPr/>
       <w:tcPr>
@@ -5538,7 +5530,7 @@
     </w:tblStylePr>
     <w:tblStylePr w:type="nwCell">
       <w:rPr>
-        <w:color w:val="ffffff" w:themeColor="background1"/>
+        <w:color w:val="ffffff"/>
       </w:rPr>
       <w:tblPr/>
       <w:tcPr>
@@ -5559,8 +5551,8 @@
     <w:uiPriority w:val="66"/>
     <w:rsid w:val="001E3FC6"/>
     <w:rPr>
-      <w:rFonts w:asciiTheme="majorHAnsi" w:cstheme="majorBidi" w:eastAsiaTheme="majorEastAsia" w:hAnsiTheme="majorHAnsi"/>
-      <w:color w:val="53565a" w:themeColor="text1"/>
+      <w:rFonts w:ascii="Verdana" w:hAnsi="Verdana" w:eastAsia="Verdana" w:cs="Verdana"/>
+      <w:color w:val="53565a"/>
     </w:rPr>
     <w:tblPr>
       <w:tblStyleRowBandSize w:val="1"/>
@@ -5677,8 +5669,8 @@
     <w:uiPriority w:val="66"/>
     <w:rsid w:val="001E3FC6"/>
     <w:rPr>
-      <w:rFonts w:asciiTheme="majorHAnsi" w:cstheme="majorBidi" w:eastAsiaTheme="majorEastAsia" w:hAnsiTheme="majorHAnsi"/>
-      <w:color w:val="53565a" w:themeColor="text1"/>
+      <w:rFonts w:ascii="Verdana" w:hAnsi="Verdana" w:eastAsia="Verdana" w:cs="Verdana"/>
+      <w:color w:val="53565a"/>
     </w:rPr>
     <w:tblPr>
       <w:tblStyleRowBandSize w:val="1"/>
@@ -5795,7 +5787,7 @@
     <w:uiPriority w:val="65"/>
     <w:rsid w:val="001E3FC6"/>
     <w:rPr>
-      <w:color w:val="53565a" w:themeColor="text1"/>
+      <w:color w:val="53565a"/>
     </w:rPr>
     <w:tblPr>
       <w:tblStyleRowBandSize w:val="1"/>
@@ -5807,7 +5799,7 @@
     </w:tblPr>
     <w:tblStylePr w:type="firstRow">
       <w:rPr>
-        <w:rFonts w:asciiTheme="majorHAnsi" w:cstheme="majorBidi" w:eastAsiaTheme="majorEastAsia" w:hAnsiTheme="majorHAnsi"/>
+        <w:rFonts w:ascii="Verdana" w:hAnsi="Verdana" w:eastAsia="Verdana" w:cs="Verdana"/>
       </w:rPr>
       <w:tblPr/>
       <w:tcPr>
@@ -5821,7 +5813,7 @@
       <w:rPr>
         <w:b w:val="1"/>
         <w:bCs w:val="1"/>
-        <w:color w:val="008c95" w:themeColor="text2"/>
+        <w:color w:val="008c95"/>
       </w:rPr>
       <w:tblPr/>
       <w:tcPr>
@@ -6015,7 +6007,7 @@
         <w:bCs w:val="1"/>
         <w:i w:val="0"/>
         <w:iCs w:val="0"/>
-        <w:color w:val="ffffff" w:themeColor="background1"/>
+        <w:color w:val="ffffff"/>
       </w:rPr>
       <w:tblPr/>
       <w:tcPr>
@@ -6036,7 +6028,7 @@
         <w:bCs w:val="1"/>
         <w:i w:val="0"/>
         <w:iCs w:val="0"/>
-        <w:color w:val="ffffff" w:themeColor="background1"/>
+        <w:color w:val="ffffff"/>
       </w:rPr>
       <w:tblPr/>
       <w:tcPr>
@@ -6057,7 +6049,7 @@
         <w:bCs w:val="1"/>
         <w:i w:val="0"/>
         <w:iCs w:val="0"/>
-        <w:color w:val="ffffff" w:themeColor="background1"/>
+        <w:color w:val="ffffff"/>
       </w:rPr>
       <w:tblPr/>
       <w:tcPr>
@@ -6076,7 +6068,7 @@
         <w:bCs w:val="1"/>
         <w:i w:val="0"/>
         <w:iCs w:val="0"/>
-        <w:color w:val="ffffff" w:themeColor="background1"/>
+        <w:color w:val="ffffff"/>
       </w:rPr>
       <w:tblPr/>
       <w:tcPr>
@@ -6146,7 +6138,7 @@
         <w:bCs w:val="1"/>
         <w:i w:val="0"/>
         <w:iCs w:val="0"/>
-        <w:color w:val="ffffff" w:themeColor="background1"/>
+        <w:color w:val="ffffff"/>
       </w:rPr>
       <w:tblPr/>
       <w:tcPr>
@@ -6167,7 +6159,7 @@
         <w:bCs w:val="1"/>
         <w:i w:val="0"/>
         <w:iCs w:val="0"/>
-        <w:color w:val="ffffff" w:themeColor="background1"/>
+        <w:color w:val="ffffff"/>
       </w:rPr>
       <w:tblPr/>
       <w:tcPr>
@@ -6188,7 +6180,7 @@
         <w:bCs w:val="1"/>
         <w:i w:val="0"/>
         <w:iCs w:val="0"/>
-        <w:color w:val="ffffff" w:themeColor="background1"/>
+        <w:color w:val="ffffff"/>
       </w:rPr>
       <w:tblPr/>
       <w:tcPr>
@@ -6207,7 +6199,7 @@
         <w:bCs w:val="1"/>
         <w:i w:val="0"/>
         <w:iCs w:val="0"/>
-        <w:color w:val="ffffff" w:themeColor="background1"/>
+        <w:color w:val="ffffff"/>
       </w:rPr>
       <w:tblPr/>
       <w:tcPr>
@@ -6257,7 +6249,7 @@
     <w:uiPriority w:val="70"/>
     <w:rsid w:val="001E3FC6"/>
     <w:rPr>
-      <w:color w:val="ffffff" w:themeColor="background1"/>
+      <w:color w:val="ffffff"/>
     </w:rPr>
     <w:tblPr>
       <w:tblStyleRowBandSize w:val="1"/>
@@ -6361,7 +6353,7 @@
     <w:uiPriority w:val="71"/>
     <w:rsid w:val="001E3FC6"/>
     <w:rPr>
-      <w:color w:val="53565a" w:themeColor="text1"/>
+      <w:color w:val="53565a"/>
     </w:rPr>
     <w:tblPr>
       <w:tblStyleRowBandSize w:val="1"/>
@@ -6400,7 +6392,7 @@
       <w:rPr>
         <w:b w:val="1"/>
         <w:bCs w:val="1"/>
-        <w:color w:val="ffffff" w:themeColor="background1"/>
+        <w:color w:val="ffffff"/>
       </w:rPr>
       <w:tblPr/>
       <w:tcPr>
@@ -6412,7 +6404,7 @@
     </w:tblStylePr>
     <w:tblStylePr w:type="firstCol">
       <w:rPr>
-        <w:color w:val="ffffff" w:themeColor="background1"/>
+        <w:color w:val="ffffff"/>
       </w:rPr>
       <w:tblPr/>
       <w:tcPr>
@@ -6429,7 +6421,7 @@
     </w:tblStylePr>
     <w:tblStylePr w:type="lastCol">
       <w:rPr>
-        <w:color w:val="ffffff" w:themeColor="background1"/>
+        <w:color w:val="ffffff"/>
       </w:rPr>
       <w:tblPr/>
       <w:tcPr>
@@ -6458,12 +6450,12 @@
     </w:tblStylePr>
     <w:tblStylePr w:type="neCell">
       <w:rPr>
-        <w:color w:val="53565a" w:themeColor="text1"/>
+        <w:color w:val="53565a"/>
       </w:rPr>
     </w:tblStylePr>
     <w:tblStylePr w:type="nwCell">
       <w:rPr>
-        <w:color w:val="53565a" w:themeColor="text1"/>
+        <w:color w:val="53565a"/>
       </w:rPr>
     </w:tblStylePr>
   </w:style>
@@ -6473,7 +6465,7 @@
     <w:uiPriority w:val="73"/>
     <w:rsid w:val="001E3FC6"/>
     <w:rPr>
-      <w:color w:val="53565a" w:themeColor="text1"/>
+      <w:color w:val="53565a"/>
     </w:rPr>
     <w:tblPr>
       <w:tblStyleRowBandSize w:val="1"/>
@@ -6499,7 +6491,7 @@
       <w:rPr>
         <w:b w:val="1"/>
         <w:bCs w:val="1"/>
-        <w:color w:val="53565a" w:themeColor="text1"/>
+        <w:color w:val="53565a"/>
       </w:rPr>
       <w:tblPr/>
       <w:tcPr>
@@ -6508,7 +6500,7 @@
     </w:tblStylePr>
     <w:tblStylePr w:type="firstCol">
       <w:rPr>
-        <w:color w:val="ffffff" w:themeColor="background1"/>
+        <w:color w:val="ffffff"/>
       </w:rPr>
       <w:tblPr/>
       <w:tcPr>
@@ -6517,7 +6509,7 @@
     </w:tblStylePr>
     <w:tblStylePr w:type="lastCol">
       <w:rPr>
-        <w:color w:val="ffffff" w:themeColor="background1"/>
+        <w:color w:val="ffffff"/>
       </w:rPr>
       <w:tblPr/>
       <w:tcPr>
@@ -6559,7 +6551,7 @@
         <w:spacing w:after="0" w:before="0" w:line="240" w:lineRule="auto"/>
       </w:pPr>
       <w:rPr>
-        <w:rFonts w:asciiTheme="majorHAnsi" w:cstheme="majorBidi" w:eastAsiaTheme="majorEastAsia" w:hAnsiTheme="majorHAnsi"/>
+        <w:rFonts w:ascii="Verdana" w:hAnsi="Verdana" w:eastAsia="Verdana" w:cs="Verdana"/>
         <w:b w:val="1"/>
         <w:bCs w:val="1"/>
       </w:rPr>
@@ -6580,7 +6572,7 @@
         <w:spacing w:after="0" w:before="0" w:line="240" w:lineRule="auto"/>
       </w:pPr>
       <w:rPr>
-        <w:rFonts w:asciiTheme="majorHAnsi" w:cstheme="majorBidi" w:eastAsiaTheme="majorEastAsia" w:hAnsiTheme="majorHAnsi"/>
+        <w:rFonts w:ascii="Verdana" w:hAnsi="Verdana" w:eastAsia="Verdana" w:cs="Verdana"/>
         <w:b w:val="1"/>
         <w:bCs w:val="1"/>
       </w:rPr>
@@ -6598,14 +6590,14 @@
     </w:tblStylePr>
     <w:tblStylePr w:type="firstCol">
       <w:rPr>
-        <w:rFonts w:asciiTheme="majorHAnsi" w:cstheme="majorBidi" w:eastAsiaTheme="majorEastAsia" w:hAnsiTheme="majorHAnsi"/>
+        <w:rFonts w:ascii="Verdana" w:hAnsi="Verdana" w:eastAsia="Verdana" w:cs="Verdana"/>
         <w:b w:val="1"/>
         <w:bCs w:val="1"/>
       </w:rPr>
     </w:tblStylePr>
     <w:tblStylePr w:type="lastCol">
       <w:rPr>
-        <w:rFonts w:asciiTheme="majorHAnsi" w:cstheme="majorBidi" w:eastAsiaTheme="majorEastAsia" w:hAnsiTheme="majorHAnsi"/>
+        <w:rFonts w:ascii="Verdana" w:hAnsi="Verdana" w:eastAsia="Verdana" w:cs="Verdana"/>
         <w:b w:val="1"/>
         <w:bCs w:val="1"/>
       </w:rPr>
@@ -6679,7 +6671,7 @@
       <w:rPr>
         <w:b w:val="1"/>
         <w:bCs w:val="1"/>
-        <w:color w:val="ffffff" w:themeColor="background1"/>
+        <w:color w:val="ffffff"/>
       </w:rPr>
       <w:tblPr/>
       <w:tcPr>
@@ -6761,7 +6753,7 @@
       <w:rPr>
         <w:b w:val="1"/>
         <w:bCs w:val="1"/>
-        <w:color w:val="ffffff" w:themeColor="background1"/>
+        <w:color w:val="ffffff"/>
       </w:rPr>
       <w:tblPr/>
       <w:tcPr>
@@ -6824,7 +6816,7 @@
   <w:style w:type="table" w:styleId="Table1">
     <w:basedOn w:val="TableNormal"/>
     <w:rPr>
-      <w:rFonts w:ascii="Calibri" w:cs="Calibri" w:eastAsia="Calibri" w:hAnsi="Calibri"/>
+      <w:rFonts w:ascii="Verdana" w:cs="Verdana" w:eastAsia="Verdana" w:hAnsi="Verdana"/>
       <w:color w:val="53565a"/>
     </w:rPr>
     <w:tblPr>
@@ -6844,7 +6836,7 @@
   <w:style w:type="table" w:styleId="Table2">
     <w:basedOn w:val="TableNormal"/>
     <w:rPr>
-      <w:rFonts w:ascii="Calibri" w:cs="Calibri" w:eastAsia="Calibri" w:hAnsi="Calibri"/>
+      <w:rFonts w:ascii="Verdana" w:cs="Verdana" w:eastAsia="Verdana" w:hAnsi="Verdana"/>
       <w:color w:val="53565a"/>
     </w:rPr>
     <w:tblPr>
@@ -6864,7 +6856,7 @@
   <w:style w:type="table" w:styleId="Table3">
     <w:basedOn w:val="TableNormal"/>
     <w:rPr>
-      <w:rFonts w:ascii="Calibri" w:cs="Calibri" w:eastAsia="Calibri" w:hAnsi="Calibri"/>
+      <w:rFonts w:ascii="Verdana" w:cs="Verdana" w:eastAsia="Verdana" w:hAnsi="Verdana"/>
       <w:color w:val="53565a"/>
     </w:rPr>
     <w:tblPr>
@@ -6884,7 +6876,7 @@
   <w:style w:type="table" w:styleId="Table4">
     <w:basedOn w:val="TableNormal"/>
     <w:rPr>
-      <w:rFonts w:ascii="Calibri" w:cs="Calibri" w:eastAsia="Calibri" w:hAnsi="Calibri"/>
+      <w:rFonts w:ascii="Verdana" w:cs="Verdana" w:eastAsia="Verdana" w:hAnsi="Verdana"/>
       <w:color w:val="53565a"/>
     </w:rPr>
     <w:tblPr>
@@ -6904,7 +6896,7 @@
   <w:style w:type="table" w:styleId="Table5">
     <w:basedOn w:val="TableNormal"/>
     <w:rPr>
-      <w:rFonts w:ascii="Calibri" w:cs="Calibri" w:eastAsia="Calibri" w:hAnsi="Calibri"/>
+      <w:rFonts w:ascii="Verdana" w:cs="Verdana" w:eastAsia="Verdana" w:hAnsi="Verdana"/>
       <w:color w:val="53565a"/>
     </w:rPr>
     <w:tblPr>
@@ -6924,7 +6916,7 @@
   <w:style w:type="table" w:styleId="Table1">
     <w:basedOn w:val="TableNormal"/>
     <w:rPr>
-      <w:rFonts w:ascii="Calibri" w:cs="Calibri" w:eastAsia="Calibri" w:hAnsi="Calibri"/>
+      <w:rFonts w:ascii="Verdana" w:cs="Verdana" w:eastAsia="Verdana" w:hAnsi="Verdana"/>
       <w:color w:val="53565a"/>
     </w:rPr>
     <w:tblPr>
@@ -6944,7 +6936,7 @@
   <w:style w:type="table" w:styleId="Table2">
     <w:basedOn w:val="TableNormal"/>
     <w:rPr>
-      <w:rFonts w:ascii="Calibri" w:cs="Calibri" w:eastAsia="Calibri" w:hAnsi="Calibri"/>
+      <w:rFonts w:ascii="Verdana" w:cs="Verdana" w:eastAsia="Verdana" w:hAnsi="Verdana"/>
       <w:color w:val="53565a"/>
     </w:rPr>
     <w:tblPr>
@@ -6964,7 +6956,7 @@
   <w:style w:type="table" w:styleId="Table3">
     <w:basedOn w:val="TableNormal"/>
     <w:rPr>
-      <w:rFonts w:ascii="Calibri" w:cs="Calibri" w:eastAsia="Calibri" w:hAnsi="Calibri"/>
+      <w:rFonts w:ascii="Verdana" w:cs="Verdana" w:eastAsia="Verdana" w:hAnsi="Verdana"/>
       <w:color w:val="53565a"/>
     </w:rPr>
     <w:tblPr>
@@ -6984,7 +6976,7 @@
   <w:style w:type="table" w:styleId="Table4">
     <w:basedOn w:val="TableNormal"/>
     <w:rPr>
-      <w:rFonts w:ascii="Calibri" w:cs="Calibri" w:eastAsia="Calibri" w:hAnsi="Calibri"/>
+      <w:rFonts w:ascii="Verdana" w:cs="Verdana" w:eastAsia="Verdana" w:hAnsi="Verdana"/>
       <w:color w:val="53565a"/>
     </w:rPr>
     <w:tblPr>
@@ -7004,7 +6996,7 @@
   <w:style w:type="table" w:styleId="Table5">
     <w:basedOn w:val="TableNormal"/>
     <w:rPr>
-      <w:rFonts w:ascii="Calibri" w:cs="Calibri" w:eastAsia="Calibri" w:hAnsi="Calibri"/>
+      <w:rFonts w:ascii="Verdana" w:cs="Verdana" w:eastAsia="Verdana" w:hAnsi="Verdana"/>
       <w:color w:val="53565a"/>
     </w:rPr>
     <w:tblPr>
@@ -7037,7 +7029,7 @@
   <w:style w:type="table" w:styleId="Table1">
     <w:basedOn w:val="TableNormal"/>
     <w:rPr>
-      <w:rFonts w:ascii="Calibri" w:cs="Calibri" w:eastAsia="Calibri" w:hAnsi="Calibri"/>
+      <w:rFonts w:ascii="Verdana" w:cs="Verdana" w:eastAsia="Verdana" w:hAnsi="Verdana"/>
       <w:color w:val="53565a"/>
     </w:rPr>
     <w:tblPr>
@@ -7057,7 +7049,7 @@
   <w:style w:type="table" w:styleId="Table2">
     <w:basedOn w:val="TableNormal"/>
     <w:rPr>
-      <w:rFonts w:ascii="Calibri" w:cs="Calibri" w:eastAsia="Calibri" w:hAnsi="Calibri"/>
+      <w:rFonts w:ascii="Verdana" w:cs="Verdana" w:eastAsia="Verdana" w:hAnsi="Verdana"/>
       <w:color w:val="53565a"/>
     </w:rPr>
     <w:tblPr>
@@ -7077,7 +7069,7 @@
   <w:style w:type="table" w:styleId="Table3">
     <w:basedOn w:val="TableNormal"/>
     <w:rPr>
-      <w:rFonts w:ascii="Calibri" w:cs="Calibri" w:eastAsia="Calibri" w:hAnsi="Calibri"/>
+      <w:rFonts w:ascii="Verdana" w:cs="Verdana" w:eastAsia="Verdana" w:hAnsi="Verdana"/>
       <w:color w:val="53565a"/>
     </w:rPr>
     <w:tblPr>
@@ -7097,7 +7089,7 @@
   <w:style w:type="table" w:styleId="Table4">
     <w:basedOn w:val="TableNormal"/>
     <w:rPr>
-      <w:rFonts w:ascii="Calibri" w:cs="Calibri" w:eastAsia="Calibri" w:hAnsi="Calibri"/>
+      <w:rFonts w:ascii="Verdana" w:cs="Verdana" w:eastAsia="Verdana" w:hAnsi="Verdana"/>
       <w:color w:val="53565a"/>
     </w:rPr>
     <w:tblPr>
@@ -7117,7 +7109,7 @@
   <w:style w:type="table" w:styleId="Table5">
     <w:basedOn w:val="TableNormal"/>
     <w:rPr>
-      <w:rFonts w:ascii="Calibri" w:cs="Calibri" w:eastAsia="Calibri" w:hAnsi="Calibri"/>
+      <w:rFonts w:ascii="Verdana" w:cs="Verdana" w:eastAsia="Verdana" w:hAnsi="Verdana"/>
       <w:color w:val="53565a"/>
     </w:rPr>
     <w:tblPr>
@@ -7180,9 +7172,9 @@
     </a:clrScheme>
     <a:fontScheme name="Office">
       <a:majorFont>
-        <a:latin typeface="Calibri"/>
-        <a:ea typeface=""/>
-        <a:cs typeface=""/>
+        <a:latin typeface="Verdana"/>
+        <a:ea typeface="Verdana"/>
+        <a:cs typeface="Verdana"/>
         <a:font script="Jpan" typeface="ＭＳ Ｐゴシック"/>
         <a:font script="Hang" typeface="맑은 고딕"/>
         <a:font script="Hans" typeface="宋体"/>
@@ -7215,9 +7207,9 @@
         <a:font script="Geor" typeface="Sylfaen"/>
       </a:majorFont>
       <a:minorFont>
-        <a:latin typeface="Calibri"/>
-        <a:ea typeface=""/>
-        <a:cs typeface=""/>
+        <a:latin typeface="Verdana"/>
+        <a:ea typeface="Verdana"/>
+        <a:cs typeface="Verdana"/>
         <a:font script="Jpan" typeface="ＭＳ Ｐゴシック"/>
         <a:font script="Hang" typeface="맑은 고딕"/>
         <a:font script="Hans" typeface="宋体"/>

</xml_diff>